<commit_message>
SEQUOIADBMAINSTREAM-2228 System getSystemConfigs() 支持获取“net”类型内核参数
git-svn-id: http://192.168.20.11/sequoiadb/trunk@27361 6121f079-4a18-41d3-8c30-8870a322f2c2
</commit_message>
<xml_diff>
--- a/internal_doc/03.开发设计/Story-JS对象增强和远程化.docx
+++ b/internal_doc/03.开发设计/Story-JS对象增强和远程化.docx
@@ -5786,7 +5786,6 @@
             <w:pPr>
               <w:jc w:val="left"/>
               <w:rPr>
-                <w:rFonts w:hint="eastAsia"/>
                 <w:color w:val="FF0000"/>
               </w:rPr>
             </w:pPr>
@@ -5809,7 +5808,6 @@
             <w:pPr>
               <w:jc w:val="left"/>
               <w:rPr>
-                <w:rFonts w:hint="eastAsia"/>
                 <w:color w:val="000000" w:themeColor="text1"/>
               </w:rPr>
             </w:pPr>
@@ -14762,6 +14760,13 @@
                 <w:color w:val="000000" w:themeColor="text1"/>
               </w:rPr>
               <w:t>"abi"</w:t>
+            </w:r>
+            <w:r>
+              <w:rPr>
+                <w:rFonts w:hint="eastAsia"/>
+                <w:color w:val="000000" w:themeColor="text1"/>
+              </w:rPr>
+              <w:t>/"net"</w:t>
             </w:r>
             <w:r>
               <w:rPr>
@@ -27649,7 +27654,7 @@
           <v:shape id="_x0000_i1025" type="#_x0000_t75" style="width:384.75pt;height:161.25pt" o:ole="">
             <v:imagedata r:id="rId15" o:title=""/>
           </v:shape>
-          <o:OLEObject Type="Embed" ProgID="Visio.Drawing.11" ShapeID="_x0000_i1025" DrawAspect="Content" ObjectID="_1544355883" r:id="rId16"/>
+          <o:OLEObject Type="Embed" ProgID="Visio.Drawing.11" ShapeID="_x0000_i1025" DrawAspect="Content" ObjectID="_1547626211" r:id="rId16"/>
         </w:object>
       </w:r>
     </w:p>
@@ -27693,7 +27698,7 @@
           <v:shape id="_x0000_i1026" type="#_x0000_t75" style="width:414.75pt;height:408.75pt" o:ole="">
             <v:imagedata r:id="rId17" o:title=""/>
           </v:shape>
-          <o:OLEObject Type="Embed" ProgID="Visio.Drawing.11" ShapeID="_x0000_i1026" DrawAspect="Content" ObjectID="_1544355884" r:id="rId18"/>
+          <o:OLEObject Type="Embed" ProgID="Visio.Drawing.11" ShapeID="_x0000_i1026" DrawAspect="Content" ObjectID="_1547626212" r:id="rId18"/>
         </w:object>
       </w:r>
     </w:p>

</xml_diff>

<commit_message>
SEQUOIADBMAINSTREAM-2124 【改进】File类 find 功能允许optionObj参数中 value不填
git-svn-id: http://192.168.20.11/sequoiadb/trunk@27367 6121f079-4a18-41d3-8c30-8870a322f2c2
</commit_message>
<xml_diff>
--- a/internal_doc/03.开发设计/Story-JS对象增强和远程化.docx
+++ b/internal_doc/03.开发设计/Story-JS对象增强和远程化.docx
@@ -18180,7 +18180,35 @@
                 <w:rFonts w:hint="eastAsia"/>
                 <w:color w:val="000000" w:themeColor="text1"/>
               </w:rPr>
-              <w:t xml:space="preserve"> -vaule:</w:t>
+              <w:t xml:space="preserve"> -</w:t>
+            </w:r>
+            <w:r>
+              <w:rPr>
+                <w:rFonts w:hint="eastAsia"/>
+                <w:color w:val="000000" w:themeColor="text1"/>
+              </w:rPr>
+              <w:t>[</w:t>
+            </w:r>
+            <w:r>
+              <w:rPr>
+                <w:rFonts w:hint="eastAsia"/>
+                <w:color w:val="000000" w:themeColor="text1"/>
+              </w:rPr>
+              <w:t>vaule</w:t>
+            </w:r>
+            <w:r>
+              <w:rPr>
+                <w:rFonts w:hint="eastAsia"/>
+                <w:color w:val="000000" w:themeColor="text1"/>
+              </w:rPr>
+              <w:t>]</w:t>
+            </w:r>
+            <w:r>
+              <w:rPr>
+                <w:rFonts w:hint="eastAsia"/>
+                <w:color w:val="000000" w:themeColor="text1"/>
+              </w:rPr>
+              <w:t>:</w:t>
             </w:r>
             <w:r>
               <w:rPr>
@@ -18745,6 +18773,7 @@
                 <w:rFonts w:hint="eastAsia"/>
                 <w:color w:val="000000" w:themeColor="text1"/>
               </w:rPr>
+              <w:lastRenderedPageBreak/>
               <w:t>符只支持隐含的</w:t>
             </w:r>
             <w:r>
@@ -18759,7 +18788,6 @@
                 <w:rFonts w:hint="eastAsia"/>
                 <w:color w:val="000000" w:themeColor="text1"/>
               </w:rPr>
-              <w:lastRenderedPageBreak/>
               <w:t>如：</w:t>
             </w:r>
             <w:r>
@@ -18950,6 +18978,13 @@
                 <w:rFonts w:hint="eastAsia"/>
                 <w:color w:val="000000" w:themeColor="text1"/>
               </w:rPr>
+              <w:t xml:space="preserve">pathname: </w:t>
+            </w:r>
+            <w:r>
+              <w:rPr>
+                <w:rFonts w:hint="eastAsia"/>
+                <w:color w:val="000000" w:themeColor="text1"/>
+              </w:rPr>
               <w:t>xxxx</w:t>
             </w:r>
           </w:p>
@@ -19037,7 +19072,56 @@
                 <w:rFonts w:hint="eastAsia"/>
                 <w:color w:val="000000" w:themeColor="text1"/>
               </w:rPr>
-              <w:t>{"output.txt"})</w:t>
+              <w:t xml:space="preserve"> </w:t>
+            </w:r>
+            <w:r>
+              <w:rPr>
+                <w:rFonts w:hint="eastAsia"/>
+                <w:color w:val="000000" w:themeColor="text1"/>
+              </w:rPr>
+              <w:t>{</w:t>
+            </w:r>
+            <w:r>
+              <w:rPr>
+                <w:rFonts w:hint="eastAsia"/>
+                <w:color w:val="000000" w:themeColor="text1"/>
+              </w:rPr>
+              <w:t xml:space="preserve"> value: </w:t>
+            </w:r>
+            <w:r>
+              <w:rPr>
+                <w:rFonts w:hint="eastAsia"/>
+                <w:color w:val="000000" w:themeColor="text1"/>
+              </w:rPr>
+              <w:t>"output.txt"</w:t>
+            </w:r>
+            <w:r>
+              <w:rPr>
+                <w:rFonts w:hint="eastAsia"/>
+                <w:color w:val="000000" w:themeColor="text1"/>
+              </w:rPr>
+              <w:t xml:space="preserve"> </w:t>
+            </w:r>
+            <w:r>
+              <w:rPr>
+                <w:rFonts w:hint="eastAsia"/>
+                <w:color w:val="000000" w:themeColor="text1"/>
+              </w:rPr>
+              <w:t>}</w:t>
+            </w:r>
+            <w:r>
+              <w:rPr>
+                <w:rFonts w:hint="eastAsia"/>
+                <w:color w:val="000000" w:themeColor="text1"/>
+              </w:rPr>
+              <w:t xml:space="preserve"> </w:t>
+            </w:r>
+            <w:r>
+              <w:rPr>
+                <w:rFonts w:hint="eastAsia"/>
+                <w:color w:val="000000" w:themeColor="text1"/>
+              </w:rPr>
+              <w:t>)</w:t>
             </w:r>
           </w:p>
         </w:tc>
@@ -20446,7 +20530,15 @@
                 <w:rFonts w:hint="eastAsia"/>
                 <w:color w:val="000000" w:themeColor="text1"/>
               </w:rPr>
-              <w:t>设置创建文件的默认权限的掩码</w:t>
+              <w:t>设置创建文件的默认权限的</w:t>
+            </w:r>
+            <w:r>
+              <w:rPr>
+                <w:rFonts w:hint="eastAsia"/>
+                <w:color w:val="000000" w:themeColor="text1"/>
+              </w:rPr>
+              <w:lastRenderedPageBreak/>
+              <w:t>掩码</w:t>
             </w:r>
           </w:p>
         </w:tc>
@@ -20467,6 +20559,7 @@
                 <w:rFonts w:hint="eastAsia"/>
                 <w:color w:val="000000" w:themeColor="text1"/>
               </w:rPr>
+              <w:lastRenderedPageBreak/>
               <w:t>file.setUmask(</w:t>
             </w:r>
             <w:r>
@@ -21644,6 +21737,7 @@
                 <w:rFonts w:hint="eastAsia"/>
                 <w:color w:val="000000" w:themeColor="text1"/>
               </w:rPr>
+              <w:lastRenderedPageBreak/>
               <w:t>-</w:t>
             </w:r>
             <w:r>
@@ -21679,15 +21773,7 @@
                 <w:rFonts w:hint="eastAsia"/>
                 <w:color w:val="000000" w:themeColor="text1"/>
               </w:rPr>
-              <w:t>：对对</w:t>
-            </w:r>
-            <w:r>
-              <w:rPr>
-                <w:rFonts w:hint="eastAsia"/>
-                <w:color w:val="000000" w:themeColor="text1"/>
-              </w:rPr>
-              <w:lastRenderedPageBreak/>
-              <w:t>象进行过滤，类似于</w:t>
+              <w:t>：对对象进行过滤，类似于</w:t>
             </w:r>
             <w:r>
               <w:rPr>
@@ -22046,6 +22132,7 @@
                 <w:rFonts w:hint="eastAsia"/>
                 <w:color w:val="000000" w:themeColor="text1"/>
               </w:rPr>
+              <w:lastRenderedPageBreak/>
               <w:t>{</w:t>
             </w:r>
           </w:p>
@@ -22062,7 +22149,6 @@
                 <w:rFonts w:hint="eastAsia"/>
                 <w:color w:val="000000" w:themeColor="text1"/>
               </w:rPr>
-              <w:lastRenderedPageBreak/>
               <w:t xml:space="preserve">  name:</w:t>
             </w:r>
           </w:p>
@@ -23239,6 +23325,7 @@
                 <w:rFonts w:hint="eastAsia"/>
                 <w:color w:val="000000" w:themeColor="text1"/>
               </w:rPr>
+              <w:lastRenderedPageBreak/>
               <w:t xml:space="preserve">   "unknow"</w:t>
             </w:r>
             <w:r>
@@ -23262,7 +23349,6 @@
                 <w:rFonts w:hint="eastAsia"/>
                 <w:color w:val="000000" w:themeColor="text1"/>
               </w:rPr>
-              <w:lastRenderedPageBreak/>
               <w:t xml:space="preserve">     </w:t>
             </w:r>
             <w:r>
@@ -24876,6 +24962,7 @@
                 <w:b/>
                 <w:color w:val="FF0000"/>
               </w:rPr>
+              <w:lastRenderedPageBreak/>
               <w:t>函数名</w:t>
             </w:r>
           </w:p>
@@ -24987,7 +25074,6 @@
                 <w:rFonts w:hint="eastAsia"/>
                 <w:color w:val="000000" w:themeColor="text1"/>
               </w:rPr>
-              <w:lastRenderedPageBreak/>
               <w:t>getInfo</w:t>
             </w:r>
           </w:p>
@@ -26081,6 +26167,7 @@
                 <w:rFonts w:hint="eastAsia"/>
                 <w:color w:val="FF0000"/>
               </w:rPr>
+              <w:lastRenderedPageBreak/>
               <w:t>类型：</w:t>
             </w:r>
             <w:r>
@@ -27654,7 +27741,7 @@
           <v:shape id="_x0000_i1025" type="#_x0000_t75" style="width:384.75pt;height:161.25pt" o:ole="">
             <v:imagedata r:id="rId15" o:title=""/>
           </v:shape>
-          <o:OLEObject Type="Embed" ProgID="Visio.Drawing.11" ShapeID="_x0000_i1025" DrawAspect="Content" ObjectID="_1547626211" r:id="rId16"/>
+          <o:OLEObject Type="Embed" ProgID="Visio.Drawing.11" ShapeID="_x0000_i1025" DrawAspect="Content" ObjectID="_1547705029" r:id="rId16"/>
         </w:object>
       </w:r>
     </w:p>
@@ -27698,7 +27785,7 @@
           <v:shape id="_x0000_i1026" type="#_x0000_t75" style="width:414.75pt;height:408.75pt" o:ole="">
             <v:imagedata r:id="rId17" o:title=""/>
           </v:shape>
-          <o:OLEObject Type="Embed" ProgID="Visio.Drawing.11" ShapeID="_x0000_i1026" DrawAspect="Content" ObjectID="_1547626212" r:id="rId18"/>
+          <o:OLEObject Type="Embed" ProgID="Visio.Drawing.11" ShapeID="_x0000_i1026" DrawAspect="Content" ObjectID="_1547705030" r:id="rId18"/>
         </w:object>
       </w:r>
     </w:p>
@@ -56074,7 +56161,7 @@
 </file>
 
 <file path=customXml/itemProps1.xml><?xml version="1.0" encoding="utf-8"?>
-<ds:datastoreItem xmlns:ds="http://schemas.openxmlformats.org/officeDocument/2006/customXml" ds:itemID="{EACC5FA2-6075-4376-A600-D9734C4B78B4}">
+<ds:datastoreItem xmlns:ds="http://schemas.openxmlformats.org/officeDocument/2006/customXml" ds:itemID="{E39411DC-4006-4857-8F2F-7FC67B1B49DF}">
   <ds:schemaRefs>
     <ds:schemaRef ds:uri="http://schemas.openxmlformats.org/officeDocument/2006/bibliography"/>
   </ds:schemaRefs>

</xml_diff>